<commit_message>
chore: submit PA4 and PA5 deliverables including progress tracker and docs
</commit_message>
<xml_diff>
--- a/pa/PA4/PA4-Group11/Use-case_Specs_-rup_ucspec_for_PA4.docx
+++ b/pa/PA4/PA4-Group11/Use-case_Specs_-rup_ucspec_for_PA4.docx
@@ -716,7 +716,17 @@
                 <w:rtl w:val="0"/>
                 <w:lang w:val="en-US"/>
               </w:rPr>
-              <w:t>31/08/2026</w:t>
+              <w:t>28</w:t>
+            </w:r>
+            <w:bookmarkStart w:id="31" w:name="_GoBack"/>
+            <w:bookmarkEnd w:id="31"/>
+            <w:r>
+              <w:rPr>
+                <w:rFonts w:hint="default"/>
+                <w:rtl w:val="0"/>
+                <w:lang w:val="en-US"/>
+              </w:rPr>
+              <w:t>/08/2026</w:t>
             </w:r>
           </w:p>
         </w:tc>
@@ -743,6 +753,73 @@
         <w:tc>
           <w:p>
             <w:pPr>
+              <w:widowControl/>
+              <w:spacing w:line="276" w:lineRule="auto"/>
+              <w:rPr>
+                <w:rFonts w:hint="default"/>
+                <w:rtl w:val="0"/>
+                <w:lang w:val="en-US"/>
+              </w:rPr>
+            </w:pPr>
+            <w:r>
+              <w:rPr>
+                <w:rFonts w:hint="default"/>
+                <w:rtl w:val="0"/>
+                <w:lang w:val="en-US"/>
+              </w:rPr>
+              <w:t xml:space="preserve">Update UC2.3:  AF1. </w:t>
+            </w:r>
+            <w:r>
+              <w:rPr>
+                <w:rFonts w:hint="default"/>
+                <w:rtl w:val="0"/>
+              </w:rPr>
+              <w:t>Input field and submit button are disabled for Viewer role, preventing any interaction</w:t>
+            </w:r>
+            <w:r>
+              <w:rPr>
+                <w:rFonts w:hint="default"/>
+                <w:rtl w:val="0"/>
+                <w:lang w:val="en-US"/>
+              </w:rPr>
+              <w:t>.</w:t>
+            </w:r>
+          </w:p>
+          <w:p>
+            <w:pPr>
+              <w:widowControl/>
+              <w:spacing w:line="276" w:lineRule="auto"/>
+              <w:rPr>
+                <w:rFonts w:hint="default"/>
+                <w:rtl w:val="0"/>
+                <w:lang w:val="en-US"/>
+              </w:rPr>
+            </w:pPr>
+            <w:r>
+              <w:rPr>
+                <w:rFonts w:hint="default"/>
+                <w:rtl w:val="0"/>
+                <w:lang w:val="en-US"/>
+              </w:rPr>
+              <w:t>Update UC2.4: AF</w:t>
+            </w:r>
+            <w:r>
+              <w:rPr>
+                <w:rtl w:val="0"/>
+              </w:rPr>
+              <w:t xml:space="preserve">1. Viewers </w:t>
+            </w:r>
+            <w:r>
+              <w:rPr>
+                <w:rFonts w:hint="default"/>
+                <w:rtl w:val="0"/>
+                <w:lang w:val="en-US"/>
+              </w:rPr>
+              <w:t>can’t see and click “Add activity/place”.</w:t>
+            </w:r>
+          </w:p>
+          <w:p>
+            <w:pPr>
               <w:keepLines/>
               <w:rPr>
                 <w:rFonts w:hint="default"/>
@@ -756,7 +833,7 @@
                 <w:rtl w:val="0"/>
                 <w:lang w:val="en-US"/>
               </w:rPr>
-              <w:t>Update UC2.9: View can’t see the edit button.</w:t>
+              <w:t>Update UC2.9: Viewer can’t see the edit button.</w:t>
             </w:r>
           </w:p>
           <w:p>
@@ -775,6 +852,22 @@
                 <w:lang w:val="en-US"/>
               </w:rPr>
               <w:t>Update UC2.7: Remove weather metadata retrieval.</w:t>
+            </w:r>
+            <w:r>
+              <w:rPr>
+                <w:rFonts w:hint="default"/>
+                <w:rtl w:val="0"/>
+                <w:lang w:val="en-US"/>
+              </w:rPr>
+              <w:br w:type="textWrapping"/>
+            </w:r>
+            <w:r>
+              <w:rPr>
+                <w:rFonts w:hint="default"/>
+                <w:rtl w:val="0"/>
+                <w:lang w:val="en-US"/>
+              </w:rPr>
+              <w:t>Update UC15: Removed "Voting" and "Alternative Proposals" features to reduce scope complexity. Redefined basic and alternative flows to focus exclusively on text-based discussion (Comments). Removed "Vote Tie Resolution" flow.</w:t>
             </w:r>
           </w:p>
           <w:p>
@@ -5379,12 +5472,17 @@
             <w:pPr>
               <w:widowControl/>
               <w:spacing w:line="276" w:lineRule="auto"/>
-            </w:pPr>
-            <w:r>
-              <w:rPr>
-                <w:rtl w:val="0"/>
-              </w:rPr>
-              <w:t>1a. If a user with 'Viewer' status submits an AI prompt, the system halts the execution flow before contacting the GenAI System and displays an error modal: "403 Permission Denied. Viewers cannot modify trip schedules."</w:t>
+              <w:rPr>
+                <w:rFonts w:hint="default"/>
+                <w:rtl w:val="0"/>
+              </w:rPr>
+            </w:pPr>
+            <w:r>
+              <w:rPr>
+                <w:rFonts w:hint="default"/>
+                <w:rtl w:val="0"/>
+              </w:rPr>
+              <w:t>Input field and submit button are disabled for Viewer role, preventing any interaction</w:t>
             </w:r>
           </w:p>
           <w:p>
@@ -7494,6 +7592,9 @@
           <w:p>
             <w:pPr>
               <w:widowControl/>
+              <w:numPr>
+                <w:numId w:val="0"/>
+              </w:numPr>
               <w:spacing w:line="276" w:lineRule="auto"/>
               <w:rPr>
                 <w:b/>
@@ -7502,9 +7603,10 @@
             </w:pPr>
             <w:r>
               <w:rPr>
-                <w:rtl w:val="0"/>
-              </w:rPr>
-              <w:t>1a. If an account with Viewer permissions attempts to click data-modifying buttons (such as adding locations or changing the schedule), the system displays an action-denied warning and maintains the read-only interface.</w:t>
+                <w:rFonts w:hint="default"/>
+                <w:rtl w:val="0"/>
+              </w:rPr>
+              <w:t>Editing UI controls are hidden from the DOM, preventing any interaction</w:t>
             </w:r>
           </w:p>
         </w:tc>
@@ -7895,7 +7997,7 @@
               <w:rPr>
                 <w:rtl w:val="0"/>
               </w:rPr>
-              <w:t>Generates a customized packing checklist based on trip destination weather forecast, duration, and planned activities.</w:t>
+              <w:t>Generates a customized packing checklist based on trip destination duration, and planned activities.</w:t>
             </w:r>
           </w:p>
         </w:tc>
@@ -12966,7 +13068,7 @@
               <w:rPr>
                 <w:rtl w:val="0"/>
               </w:rPr>
-              <w:t>Group Member Interaction (Voting and Comments)</w:t>
+              <w:t>Group Member Interaction (Comments)</w:t>
             </w:r>
           </w:p>
         </w:tc>
@@ -13034,9 +13136,10 @@
             </w:pPr>
             <w:r>
               <w:rPr>
-                <w:rtl w:val="0"/>
-              </w:rPr>
-              <w:t>Allows trip members to discuss and vote on an itinerary activity or a proposed alternative before a Trip Owner or Editor changes the itinerary.</w:t>
+                <w:rFonts w:hint="default"/>
+                <w:rtl w:val="0"/>
+              </w:rPr>
+              <w:t>Allows trip members to discuss and leave comments on an itinerary activity to share thoughts, tips, or feedback before a Trip Owner or Editor modifies the itinerary.</w:t>
             </w:r>
           </w:p>
         </w:tc>
@@ -13168,110 +13271,102 @@
           </w:tcPr>
           <w:p>
             <w:pPr>
-              <w:spacing w:line="276" w:lineRule="auto"/>
-            </w:pPr>
-            <w:r>
-              <w:rPr>
-                <w:rtl w:val="0"/>
-              </w:rPr>
-              <w:t>1. A member opens an activity or saved-place card.</w:t>
-            </w:r>
-          </w:p>
-          <w:p>
-            <w:pPr>
-              <w:spacing w:line="276" w:lineRule="auto"/>
-            </w:pPr>
-            <w:r>
+              <w:numPr>
+                <w:ilvl w:val="0"/>
+                <w:numId w:val="5"/>
+              </w:numPr>
+              <w:spacing w:line="276" w:lineRule="auto"/>
               <w:rPr>
                 <w:rFonts w:hint="default"/>
                 <w:rtl w:val="0"/>
-                <w:lang w:val="en-US"/>
-              </w:rPr>
-              <w:t xml:space="preserve">2. </w:t>
-            </w:r>
-            <w:r>
-              <w:rPr>
-                <w:rtl w:val="0"/>
-              </w:rPr>
-              <w:t>The member writes a comment or proposes an alternative.</w:t>
-            </w:r>
-          </w:p>
-          <w:p>
-            <w:pPr>
-              <w:spacing w:line="276" w:lineRule="auto"/>
+              </w:rPr>
             </w:pPr>
             <w:r>
               <w:rPr>
                 <w:rFonts w:hint="default"/>
                 <w:rtl w:val="0"/>
-                <w:lang w:val="en-US"/>
-              </w:rPr>
-              <w:t xml:space="preserve">3. </w:t>
-            </w:r>
-            <w:r>
-              <w:rPr>
-                <w:rtl w:val="0"/>
-              </w:rPr>
-              <w:t>The system saves and displays the comment or proposal to trip members.</w:t>
-            </w:r>
-          </w:p>
-          <w:p>
-            <w:pPr>
-              <w:spacing w:line="276" w:lineRule="auto"/>
-            </w:pPr>
-            <w:r>
+              </w:rPr>
+              <w:t>A member opens an activity card on the itinerary timeline.</w:t>
+            </w:r>
+          </w:p>
+          <w:p>
+            <w:pPr>
+              <w:numPr>
+                <w:ilvl w:val="0"/>
+                <w:numId w:val="5"/>
+              </w:numPr>
+              <w:spacing w:line="276" w:lineRule="auto"/>
+              <w:ind w:left="0" w:leftChars="0" w:firstLine="0" w:firstLineChars="0"/>
               <w:rPr>
                 <w:rFonts w:hint="default"/>
                 <w:rtl w:val="0"/>
-                <w:lang w:val="en-US"/>
-              </w:rPr>
-              <w:t xml:space="preserve">4. </w:t>
-            </w:r>
-            <w:r>
-              <w:rPr>
-                <w:rtl w:val="0"/>
-              </w:rPr>
-              <w:t>Members vote for an available option.</w:t>
-            </w:r>
-          </w:p>
-          <w:p>
-            <w:pPr>
-              <w:spacing w:line="276" w:lineRule="auto"/>
+              </w:rPr>
             </w:pPr>
             <w:r>
               <w:rPr>
                 <w:rFonts w:hint="default"/>
                 <w:rtl w:val="0"/>
-                <w:lang w:val="en-US"/>
-              </w:rPr>
-              <w:t xml:space="preserve">5. </w:t>
-            </w:r>
-            <w:r>
-              <w:rPr>
-                <w:rtl w:val="0"/>
-              </w:rPr>
-              <w:t>The system displays vote totals.</w:t>
-            </w:r>
-            <w:bookmarkStart w:id="31" w:name="_GoBack"/>
-            <w:bookmarkEnd w:id="31"/>
-          </w:p>
-          <w:p>
-            <w:pPr>
-              <w:spacing w:line="276" w:lineRule="auto"/>
-            </w:pPr>
-            <w:r>
+              </w:rPr>
+              <w:t>The member writes a comment in the discussion thread of that activity.</w:t>
+            </w:r>
+          </w:p>
+          <w:p>
+            <w:pPr>
+              <w:numPr>
+                <w:ilvl w:val="0"/>
+                <w:numId w:val="5"/>
+              </w:numPr>
+              <w:spacing w:line="276" w:lineRule="auto"/>
+              <w:ind w:left="0" w:leftChars="0" w:firstLine="0" w:firstLineChars="0"/>
               <w:rPr>
                 <w:rFonts w:hint="default"/>
                 <w:rtl w:val="0"/>
-                <w:lang w:val="en-US"/>
-              </w:rPr>
-              <w:t xml:space="preserve">6. </w:t>
-            </w:r>
-            <w:r>
-              <w:rPr>
-                <w:rtl w:val="0"/>
-              </w:rPr>
-              <w:t>A Trip Owner or Editor may use the result as input for UC 2.3 or UC 2.4.</w:t>
+              </w:rPr>
+            </w:pPr>
+            <w:r>
+              <w:rPr>
+                <w:rFonts w:hint="default"/>
+                <w:rtl w:val="0"/>
+              </w:rPr>
+              <w:t>The member clicks "Submit" to post the comment.</w:t>
+            </w:r>
+          </w:p>
+          <w:p>
+            <w:pPr>
+              <w:numPr>
+                <w:ilvl w:val="0"/>
+                <w:numId w:val="5"/>
+              </w:numPr>
+              <w:spacing w:line="276" w:lineRule="auto"/>
+              <w:ind w:left="0" w:leftChars="0" w:firstLine="0" w:firstLineChars="0"/>
+              <w:rPr>
+                <w:rFonts w:hint="default"/>
+                <w:rtl w:val="0"/>
+              </w:rPr>
+            </w:pPr>
+            <w:r>
+              <w:rPr>
+                <w:rFonts w:hint="default"/>
+                <w:rtl w:val="0"/>
+              </w:rPr>
+              <w:t>The system saves the comment to the database and instantly displays it to all trip members viewing the activity.</w:t>
+            </w:r>
+          </w:p>
+          <w:p>
+            <w:pPr>
+              <w:numPr>
+                <w:ilvl w:val="0"/>
+                <w:numId w:val="5"/>
+              </w:numPr>
+              <w:spacing w:line="276" w:lineRule="auto"/>
+              <w:ind w:left="0" w:leftChars="0" w:firstLine="0" w:firstLineChars="0"/>
+            </w:pPr>
+            <w:r>
+              <w:rPr>
+                <w:rFonts w:hint="default"/>
+                <w:rtl w:val="0"/>
+              </w:rPr>
+              <w:t>A Trip Owner or Editor may read the discussion and use it as input/reference for modifying the itinerary (UC 2.3 or UC 2.4).</w:t>
             </w:r>
           </w:p>
         </w:tc>
@@ -13352,20 +13447,27 @@
           <w:p>
             <w:pPr>
               <w:spacing w:line="276" w:lineRule="auto"/>
-            </w:pPr>
-            <w:r>
-              <w:rPr>
-                <w:rtl w:val="0"/>
-              </w:rPr>
-              <w:t>A Viewer can comment and vote but cannot apply a change to the itinerary.</w:t>
-            </w:r>
-          </w:p>
-          <w:p>
-            <w:pPr>
-              <w:spacing w:line="276" w:lineRule="auto"/>
-              <w:rPr>
+              <w:rPr>
+                <w:rFonts w:hint="default"/>
+                <w:rtl w:val="0"/>
+              </w:rPr>
+            </w:pPr>
+            <w:r>
+              <w:rPr>
+                <w:rFonts w:hint="default"/>
+                <w:rtl w:val="0"/>
+              </w:rPr>
+              <w:t>A Viewer is fully allowed to participate in the discussion and post comments, but they cannot apply any direct changes to the itinerary itself based on the discussion (the "Apply Change / Edit" controls remain locked or hidden for Viewers).</w:t>
+            </w:r>
+          </w:p>
+          <w:p>
+            <w:pPr>
+              <w:spacing w:line="276" w:lineRule="auto"/>
+              <w:rPr>
+                <w:rFonts w:hint="default"/>
                 <w:i/>
                 <w:iCs/>
+                <w:lang w:val="en-US"/>
               </w:rPr>
             </w:pPr>
             <w:r>
@@ -13374,18 +13476,29 @@
                 <w:iCs/>
                 <w:rtl w:val="0"/>
               </w:rPr>
-              <w:t>Alternative Flow 2: Tie</w:t>
-            </w:r>
-          </w:p>
-          <w:p>
-            <w:pPr>
-              <w:spacing w:line="276" w:lineRule="auto"/>
-            </w:pPr>
-            <w:r>
-              <w:rPr>
-                <w:rtl w:val="0"/>
-              </w:rPr>
-              <w:t>The system displays “No consensus yet”; the Trip Owner makes the final decision.</w:t>
+              <w:t xml:space="preserve">Alternative Flow 2: </w:t>
+            </w:r>
+            <w:r>
+              <w:rPr>
+                <w:rFonts w:hint="default"/>
+                <w:i/>
+                <w:iCs/>
+                <w:rtl w:val="0"/>
+                <w:lang w:val="en-US"/>
+              </w:rPr>
+              <w:t>Empty comment submission</w:t>
+            </w:r>
+          </w:p>
+          <w:p>
+            <w:pPr>
+              <w:spacing w:line="276" w:lineRule="auto"/>
+            </w:pPr>
+            <w:r>
+              <w:rPr>
+                <w:rFonts w:hint="default"/>
+                <w:rtl w:val="0"/>
+              </w:rPr>
+              <w:t>If a member attempts to submit a comment without entering any text (empty field), the system disables the "Submit" button or displays a validation message prompting the user to type a comment first.</w:t>
             </w:r>
           </w:p>
         </w:tc>
@@ -13453,9 +13566,10 @@
             </w:pPr>
             <w:r>
               <w:rPr>
-                <w:rtl w:val="0"/>
-              </w:rPr>
-              <w:t>The user is an authenticated member of a saved trip and an activity or saved place exists.</w:t>
+                <w:rFonts w:hint="default"/>
+                <w:rtl w:val="0"/>
+              </w:rPr>
+              <w:t>The user is an authenticated member of a saved trip, and the itinerary has at least one scheduled activity available to comment on.</w:t>
             </w:r>
           </w:p>
         </w:tc>
@@ -15722,6 +15836,18 @@
     </w:lvl>
   </w:abstractNum>
   <w:abstractNum w:abstractNumId="3">
+    <w:nsid w:val="4FBD91D5"/>
+    <w:multiLevelType w:val="singleLevel"/>
+    <w:tmpl w:val="4FBD91D5"/>
+    <w:lvl w:ilvl="0" w:tentative="0">
+      <w:start w:val="1"/>
+      <w:numFmt w:val="decimal"/>
+      <w:suff w:val="space"/>
+      <w:lvlText w:val="%1."/>
+      <w:lvlJc w:val="left"/>
+    </w:lvl>
+  </w:abstractNum>
+  <w:abstractNum w:abstractNumId="4">
     <w:nsid w:val="543C84B3"/>
     <w:multiLevelType w:val="multilevel"/>
     <w:tmpl w:val="543C84B3"/>
@@ -15811,13 +15937,16 @@
     <w:abstractNumId w:val="2"/>
   </w:num>
   <w:num w:numId="2">
-    <w:abstractNumId w:val="3"/>
+    <w:abstractNumId w:val="4"/>
   </w:num>
   <w:num w:numId="3">
     <w:abstractNumId w:val="0"/>
   </w:num>
   <w:num w:numId="4">
     <w:abstractNumId w:val="1"/>
+  </w:num>
+  <w:num w:numId="5">
+    <w:abstractNumId w:val="3"/>
   </w:num>
 </w:numbering>
 </file>
@@ -15827,7 +15956,7 @@
   <w:docDefaults>
     <w:rPrDefault>
       <w:rPr>
-        <w:rFonts w:asciiTheme="minorHAnsi" w:hAnsiTheme="minorHAnsi" w:eastAsiaTheme="minorEastAsia" w:cstheme="minorBidi"/>
+        <w:rFonts w:ascii="Times New Roman" w:hAnsi="Times New Roman" w:eastAsia="SimSun" w:cs="Times New Roman"/>
       </w:rPr>
     </w:rPrDefault>
     <w:pPrDefault/>

</xml_diff>